<commit_message>
Language round 2 complete; rebuild manuscript and submission package
Co-Authored-By: Claude Opus 5.5 <noreply@anthropic.com>
Claude-Session: https://claude.ai/code/session_0187YkNxV2B2p6axbeov1Yg3
</commit_message>
<xml_diff>
--- a/Python for Algorithmic Trading/NCKH/Bài stock toán/submission/Revised_submission/02_Manuscript_Anonymized.docx
+++ b/Python for Algorithmic Trading/NCKH/Bài stock toán/submission/Revised_submission/02_Manuscript_Anonymized.docx
@@ -44,7 +44,7 @@
           <w:sz w:val="22"/>
           <w:szCs w:val="22"/>
         </w:rPr>
-        <w:t xml:space="preserve">When one equity index contains another, part of their correlation is fixed by construction. We carry the classical part–whole correlation identity over to detrended cross-correlation analysis (DCCA). At every timescale, the coefficient between a parent and a child index is then a closed-form function of the child’s weight, the relative amplitude of the remaining constituents and the overlap-purged correlation between the child and those constituents. The identity gives a zero-correlation benchmark, an exact lower bound, the sensitivity of the nested coefficient to the purged correlation and an order-free attribution, and it needs only index-level inputs. On the Ho Chi Minh City Stock Exchange (VN30 within VN100 within VNINDEX, 30-minute to daily data, 2014–2025), the VN30–VN100 coefficient moves by only about 0.11 per unit change in the purged correlation, and purging the overlap lowers the correlation with large caps by about 0.10 at every frequency. The decomposition barely varies across scales and frequencies, so its Pearson version suffices in these data. The small intraday horizon dependence of broad-market pairs comes from the opening and closing auction bars, evidence of crisis contagion depends on the test used, and regime-conditioned correlations do not improve out-of-sample portfolio variance forecasts. Correlations between nested indices therefore say little about diversification between size tiers unless the overlap is removed first.</w:t>
+        <w:t xml:space="preserve">When one equity index contains another, part of their correlation is fixed by construction. We extend the classical part–whole correlation identity to detrended cross-correlation analysis (DCCA). At every timescale, the coefficient between a parent and a child index is then a closed-form function of the child’s weight, the relative amplitude of the remaining constituents and the overlap-purged coefficient between the child and those constituents. The identity yields a zero-correlation benchmark, an exact lower bound, the sensitivity of the nested coefficient to the purged coefficient and an order-free attribution, and it requires only index-level inputs. On the Ho Chi Minh City Stock Exchange (VN30 within VN100 within VNINDEX, 30-minute to daily data, 2014–2025), the VN30–VN100 coefficient moves by only about 0.11 per unit change in the purged coefficient. Purging the overlap lowers the correlation with large caps by about 0.10 at every frequency. The decomposition barely varies across scales and frequencies, so its Pearson version suffices in these data. The small intraday horizon dependence of broad-market pairs comes from the opening and closing auction bars. Evidence of crisis contagion depends on the test used, and regime-conditioned correlations do not improve out-of-sample portfolio variance forecasts. Correlations between nested indices therefore say little about diversification between size tiers unless the overlap is removed first.</w:t>
       </w:r>
     </w:p>
     <w:p>
@@ -139,7 +139,7 @@
           <w:sz w:val="24"/>
           <w:szCs w:val="24"/>
         </w:rPr>
-        <w:t xml:space="preserve">Correlations between published equity indices are a convenient measure of how much one market segment diversifies another (Markowitz 1952). In nested index systems they have a problem unrelated to estimation error: the parent contains the child, so part of their correlation is fixed by construction. On the Ho Chi Minh City Stock Exchange (HOSE),</w:t>
+        <w:t xml:space="preserve">Correlations between published equity indices are a convenient measure of how much one market segment diversifies another (Markowitz 1952). In nested index systems, these correlations have a problem unrelated to estimation error: the parent contains the child, so part of their correlation is fixed by construction. On the Ho Chi Minh City Stock Exchange (HOSE),</w:t>
       </w:r>
     </w:p>
     <w:p>
@@ -279,7 +279,7 @@
           <w:sz w:val="24"/>
           <w:szCs w:val="24"/>
         </w:rPr>
-        <w:t xml:space="preserve">The 30 largest firms hold about two-thirds of the free-float capitalization of VN100, and the daily VN30–VN100 correlation is 0.988. Read as a measure of how mid caps move with large caps, this number mixes economic linkage with the fact that VN30 stocks are counted on both sides. Holdings-based risk models avoid the problem, but users of index-level data cannot, and index-level co-movement is easy to misread even without overlap (Chen et al. 2016). The arithmetic is old (Pearson 1897; Cureton 1966), but there is no version for the detrended, scale-dependent coefficients of the detrended cross-correlation analysis (DCCA) literature, which studies only pairs without shared constituents (Section 2).</w:t>
+        <w:t xml:space="preserve">The 30 largest firms hold about two-thirds of the free-float capitalization of VN100, and the daily VN30–VN100 correlation is 0.988. Read as a measure of how mid caps move with large caps, this number mixes economic linkage with the fact that VN30 stocks are counted on both sides. Holdings-based risk models avoid the problem; users of index-level data cannot. Index-level co-movement is easy to misread even without overlap (Chen et al. 2016). The arithmetic is old (Pearson 1897; Cureton 1966), but no version exists for the detrended, scale-dependent coefficients of the detrended cross-correlation analysis (DCCA) literature. That literature studies only pairs without shared constituents (Section 2).</w:t>
       </w:r>
     </w:p>
     <w:p>
@@ -294,7 +294,7 @@
           <w:sz w:val="24"/>
           <w:szCs w:val="24"/>
         </w:rPr>
-        <w:t xml:space="preserve">We build that version. Lemma 1 shows that, at every timescale, the DCCA coefficient of a nested pair is a known function of the child’s weight, the relative amplitude κ(s) of the remaining constituents and the overlap-purged coefficient between the child and those constituents. It yields a zero-correlation benchmark, an exact lower bound, the sensitivity of the nested coefficient to the purged one and an order-free attribution, all computable from index-level data (Box 1, Fig. 4). We apply it to VN30, VN100 and VNINDEX at 30-minute to daily frequencies (2014–2025), with a block bootstrap that also draws the index weight, and use the purged series to test hypotheses on horizon dependence, contagion and the value of regime-conditioned correlations.</w:t>
+        <w:t xml:space="preserve">Our contribution is to build that version. Lemma 1 shows that, at every timescale, the DCCA coefficient of a nested pair is a known function of the child’s weight, the relative amplitude κ(s) of the remaining constituents and the overlap-purged coefficient between the child and those constituents. It yields a zero-correlation benchmark, an exact lower bound, the sensitivity of the nested coefficient to the purged one and an order-free attribution, all computable from index-level data (Section 4.2). We apply it to VN30, VN100 and VNINDEX at 30-minute to daily frequencies (2014–2025), with a block bootstrap that also draws the index weight. We then use the purged series to test hypotheses on horizon dependence, contagion and the value of regime-conditioned correlations.</w:t>
       </w:r>
     </w:p>
     <w:p>
@@ -309,7 +309,22 @@
           <w:sz w:val="24"/>
           <w:szCs w:val="24"/>
         </w:rPr>
-        <w:t xml:space="preserve">Three findings stand out. The VN30–VN100 coefficient responds to the purged coefficient with a slope of 0.106–0.112, and the like-for-like gap between nested and purged coefficients is 0.099–0.104; because κ hardly varies with the timescale (0.47–0.52), the Pearson version gives the same answer. On the purged series, horizon dependence is confined to intraday broad-market pairs and comes from the auction bars. Crisis evidence depends on whether contagion is measured by an adjusted correlation or a factor loading, and regime-conditioned correlations do not beat a static one out of sample. Section 2 reviews the literature and states the hypotheses, Sections 3–5 present data, methods and results, Section 6 discusses them and Section 7 concludes; further checks are in Online Resource 2.</w:t>
+        <w:t xml:space="preserve">We report three main findings. The VN30–VN100 coefficient responds to the purged coefficient with a sensitivity of 0.106–0.112, and the like-for-like gap between nested and purged coefficients is 0.099–0.104; because κ hardly varies with the timescale (0.47–0.52), the Pearson version gives the same answer. On the purged series, horizon dependence is confined to intraday broad-market pairs and comes from the auction bars. Crisis evidence depends on whether contagion is measured by an adjusted correlation or a factor loading, and regime-conditioned correlations do not outperform a static one out of sample.</w:t>
+      </w:r>
+    </w:p>
+    <w:p>
+      <w:pPr>
+        <w:pStyle w:val="BodyText"/>
+        <w:spacing w:before="0" w:after="120" w:line="300" w:lineRule="auto"/>
+        <w:jc w:val="both"/>
+      </w:pPr>
+      <w:r>
+        <w:rPr>
+          <w:rFonts w:ascii="Times New Roman" w:hAnsi="Times New Roman" w:cs="Times New Roman" w:eastAsia="Times New Roman"/>
+          <w:sz w:val="24"/>
+          <w:szCs w:val="24"/>
+        </w:rPr>
+        <w:t xml:space="preserve">Section 2 reviews the literature and states the hypotheses. Sections 3–5 present the data, methods and results, Section 6 discusses them and Section 7 concludes. Further checks are in Online Resource 2.</w:t>
       </w:r>
     </w:p>
     <w:p>
@@ -342,7 +357,7 @@
           <w:sz w:val="24"/>
           <w:szCs w:val="24"/>
         </w:rPr>
-        <w:t xml:space="preserve">Five literatures bear on the question: part–whole correlation, detrended cross-correlation, index membership, size-based lead–lag effects and contagion. We review what each establishes and leaves open, then state the gap, estimands and hypotheses.</w:t>
+        <w:t xml:space="preserve">Five literatures bear on nested index correlations: part–whole correlation, detrended cross-correlation, index membership, size-based lead–lag effects and contagion. We review what each establishes and leaves open, then state the gap, estimands and hypotheses.</w:t>
       </w:r>
     </w:p>
     <w:p>
@@ -375,7 +390,7 @@
           <w:sz w:val="24"/>
           <w:szCs w:val="24"/>
         </w:rPr>
-        <w:t xml:space="preserve">Pearson (1897) showed that ratios sharing a denominator correlate even when their numerators are independent. In psychometrics the same arithmetic inflates the correlation of an item with the total score that contains it, and Cureton (1966) gave a standard correction. Both results are static Pearson identities; neither measures the component at different timescales or attaches sampling uncertainty to it. Finance handles overlap through holdings: Active Share measures how far a fund departs from its benchmark holdings (Cremers and Petajisto 2009), holdings-based risk models estimate exposures from constituents, and membership studies build comparison portfolios from stocks outside the index (Barberis et al. 2005). What is missing is a return-based counterpart for users who observe only index levels.</w:t>
+        <w:t xml:space="preserve">Pearson (1897) showed that ratios sharing a denominator correlate even when their numerators are independent. In psychometrics the same arithmetic inflates the correlation of an item with the total score that contains it, and Cureton (1966) gave a standard correction. Both results are static Pearson identities; neither measures the component at different timescales or attaches sampling uncertainty to it. Finance handles overlap through holdings: Active Share measures how far a fund departs from its benchmark holdings (Cremers and Petajisto 2009), holdings-based risk models estimate exposures from constituents, and membership studies build comparison portfolios from stocks outside the index (Barberis et al. 2005). Users who observe only index levels lack a return-based counterpart.</w:t>
       </w:r>
     </w:p>
     <w:p>
@@ -408,7 +423,7 @@
           <w:sz w:val="24"/>
           <w:szCs w:val="24"/>
         </w:rPr>
-        <w:t xml:space="preserve">DCCA extends detrended fluctuation analysis (Peng et al. 1994; Kantelhardt et al. 2002) to pairs of nonstationary series (Podobnik and Stanley 2008); Zebende (2011) normalized it into a bounded coefficient, Podobnik et al. (2011) proposed tests and Zhou (2008) generalized it to multifractal moments (MF-DCCA). Variants use moving-average detrending (Jiang and Zhou 2011; Kristoufek 2014), sliding windows (Guedes et al. 2021) or partial correlations (Ge and Lin 2021), and Oświęcimka et al. (2014) show that absolute local covariances can create spurious multifractality. Applied work finds horizon-dependent stock–bond and cross-market dependence (Al Rababa’a et al. 2021; Ge and Lin 2021; Chen et al. 2024), uses the coefficient to track contagion (Okorie and Lin 2021; Tilfani et al. 2021) or information flow (Zhou et al. 2025), and builds scale-aware portfolios (Wang et al. 2021; Kakinaka et al. 2025). All of it treats the coefficient as a measure of economic dependence between disjoint assets; none analyzes nested pairs, where the detrended covariance inherits the part–whole arithmetic at every scale.</w:t>
+        <w:t xml:space="preserve">DCCA extends detrended fluctuation analysis (Peng et al. 1994; Kantelhardt et al. 2002) to pairs of nonstationary series (Podobnik and Stanley 2008). Zebende (2011) normalized it into a bounded coefficient, Podobnik et al. (2011) proposed tests and Zhou (2008) generalized it to multifractal moments (MF-DCCA). Variants use moving-average detrending (Jiang and Zhou 2011; Kristoufek 2014), sliding windows (Guedes et al. 2021) or partial correlations (Ge and Lin 2021), and Oświęcimka et al. (2014) show that absolute local covariances can create spurious multifractality. Applied work finds horizon-dependent stock–bond and cross-market dependence (Al Rababa’a et al. 2021; Ge and Lin 2021; Chen et al. 2024). Other studies use the coefficient to track contagion (Okorie and Lin 2021; Tilfani et al. 2021) or information flow (Zhou et al. 2025) and build scale-aware portfolios (Wang et al. 2021; Kakinaka et al. 2025). These studies treat the coefficient as a measure of economic dependence between disjoint assets. None of them analyzes nested pairs, where the detrended covariance inherits the part–whole arithmetic at every scale.</w:t>
       </w:r>
     </w:p>
     <w:p>
@@ -441,7 +456,7 @@
           <w:sz w:val="24"/>
           <w:szCs w:val="24"/>
         </w:rPr>
-        <w:t xml:space="preserve">Stocks added to the S&amp;P 500 co-move more with the index (Barberis et al. 2005), Nikkei 225 stocks with larger weights co-move more with other index stocks (Greenwood 2008), and regression-discontinuity and tracking-demand designs support the effect (Liao et al. 2022; DeCoste 2025). The evidence is contested: much of the post-inclusion rise also appears in matched stocks that were not added (Chen et al. 2016), and the S&amp;P 500 index effect has almost disappeared (Greenwood and Sammon 2025). Index-level co-movement is thus easy to misread even where indices do not overlap; our concern is the arithmetic overlap, which raises correlations even if no investor trades differently.</w:t>
+        <w:t xml:space="preserve">Stocks added to the S&amp;P 500 co-move more with the index (Barberis et al. 2005), Nikkei 225 stocks with larger weights co-move more with other index stocks (Greenwood 2008), and regression-discontinuity and tracking-demand designs support the effect (Liao et al. 2022; DeCoste 2025). The evidence is contested: much of the post-inclusion rise also appears in matched stocks that were not added (Chen et al. 2016), and the S&amp;P 500 index effect has almost disappeared (Greenwood and Sammon 2025). Index-level co-movement is thus easy to misread even where indices do not overlap. Our concern is the arithmetic overlap, which raises correlations even if no investor trades differently.</w:t>
       </w:r>
     </w:p>
     <w:p>
@@ -474,7 +489,7 @@
           <w:sz w:val="24"/>
           <w:szCs w:val="24"/>
         </w:rPr>
-        <w:t xml:space="preserve">Large-firm returns lead small-firm returns (Lo and MacKinlay 1990), a pattern Hou (2007) traces to slow diffusion of industry information. Non-synchronous trading depresses short-horizon correlations (Epps 1979), with a size that depends on sampling (Chang et al. 2021), and gradual diffusion (Hong and Stein 1999) lets co-movement build with the horizon. On the HOSE, small-firm liquidity fell after a market surveillance system was introduced (Chen et al. 2021) and price adjustment is delayed under retail-heavy trading (Tran and Tran 2025), while herding in stress (Nguyen et al. 2023), sector connectedness above 60%, near 90% during COVID-19 (Bui et al. 2022) and nonlinear regional dependence (Le et al. 2025) raise all correlations at once.</w:t>
+        <w:t xml:space="preserve">Large-firm returns lead small-firm returns (Lo and MacKinlay 1990), a pattern Hou (2007) traces to slow diffusion of industry information. Non-synchronous trading depresses short-horizon correlations (Epps 1979), with a size that depends on sampling (Chang et al. 2021), and gradual diffusion (Hong and Stein 1999) lets co-movement build with the horizon. On the HOSE, small-firm liquidity fell after a market surveillance system was introduced (Chen et al. 2021), and price adjustment is delayed under retail-heavy trading (Tran and Tran 2025). Herding in stress (Nguyen et al. 2023), sector connectedness above 60%, rising to near 90% during COVID-19 (Bui et al. 2022) and nonlinear regional dependence (Le et al. 2025) raise all correlations at once.</w:t>
       </w:r>
     </w:p>
     <w:p>
@@ -507,7 +522,7 @@
           <w:sz w:val="24"/>
           <w:szCs w:val="24"/>
         </w:rPr>
-        <w:t xml:space="preserve">Equity correlations rise in downturns (Longin and Solnik 2001; Ang and Chen 2002), but they also rise mechanically with the variance of the conditioning market, so a crisis increase may reflect interdependence rather than contagion (Forbes and Rigobon 2002). The correction can itself be biased toward no contagion because it restricts the variance of idiosyncratic shocks; Corsetti et al. (2005) propose testing for a change in the factor loading instead, and Rigobon (2003) identifies transmission from regime changes in variance. Studies without the correction report COVID-19 contagion (Akhtaruzzaman et al. 2021; Guo et al. 2021; Benkraiem et al. 2022), a DCCA test finds it for some commodity pairs but not others (Santana et al. 2023), and ASEAN integration varies with trade links and volatility (Abdul Karim and Xin Ning 2013; Lean and Teng 2013). No study applies volatility-robust tests to tiers of one market whose indices overlap.</w:t>
+        <w:t xml:space="preserve">Equity correlations rise in downturns (Longin and Solnik 2001; Ang and Chen 2002), but they also rise mechanically with the variance of the conditioning market, so a crisis increase may reflect interdependence rather than contagion (Forbes and Rigobon 2002). The correction can itself be biased toward no contagion because it restricts the variance of idiosyncratic shocks. Corsetti et al. (2005) propose testing for a change in the factor loading instead, and Rigobon (2003) identifies transmission from regime changes in variance. Studies without the correction report COVID-19 contagion (Akhtaruzzaman et al. 2021; Guo et al. 2021; Benkraiem et al. 2022). A DCCA test finds it for some commodity pairs but not others (Santana et al. 2023), and ASEAN integration varies with trade links and volatility (Abdul Karim and Xin Ning 2013; Lean and Teng 2013). No study applies volatility-robust tests to tiers of one market whose indices overlap.</w:t>
       </w:r>
     </w:p>
     <w:p>
@@ -2072,7 +2087,7 @@
           <w:sz w:val="20"/>
           <w:szCs w:val="20"/>
         </w:rPr>
-        <w:t xml:space="preserve">Notes: Overlap treated: whether the study separates dependence created by shared constituents; scale-wise: whether dependence is measured by timescale; volatility-robust test: whether crisis comparisons correct for heteroskedasticity or common shocks. Source: Authors’ compilation.</w:t>
+        <w:t xml:space="preserve">Notes: Overlap treated: whether the study separates dependence created by shared constituents; scale-wise: whether dependence is measured by timescale; volatility-robust test: whether crisis comparisons correct for heteroskedasticity or common shocks; DMCA: detrending moving-average cross-correlation analysis; ρDCCA: DCCA coefficient. Source: Authors’ compilation.</w:t>
       </w:r>
     </w:p>
     <w:p>
@@ -2087,7 +2102,7 @@
           <w:sz w:val="24"/>
           <w:szCs w:val="24"/>
         </w:rPr>
-        <w:t xml:space="preserve">Three gaps follow. The part–whole identity is known for static Pearson correlations but has not been carried to scale-wise detrended coefficients, given inference under weight uncertainty, or turned into a diagnostic computable from published series. Multiscale studies of crises rarely use volatility-robust tests, and volatility-conditioned studies use one horizon and disjoint markets. To our knowledge, no study covers the Vietnamese index system at intraday and daily frequencies. We searched Google Scholar and publisher databases for 2021–2026, plus the classical sources these works cite, combining</w:t>
+        <w:t xml:space="preserve">Three gaps follow. The part–whole identity is known for static Pearson correlations but has not been extended to scale-wise detrended coefficients, equipped with inference under weight uncertainty, or turned into a diagnostic computable from published series. Multiscale studies of crises rarely use volatility-robust tests, and volatility-conditioned studies use one horizon and disjoint markets. To our knowledge, no study covers the Vietnamese index system at intraday and daily frequencies. For this review, we searched Google Scholar and publisher databases for 2021–2026, plus the classical sources these works cite. Search strings combined</w:t>
       </w:r>
       <w:r>
         <w:rPr>
@@ -2729,7 +2744,7 @@
           <w:sz w:val="24"/>
           <w:szCs w:val="24"/>
         </w:rPr>
-        <w:t xml:space="preserve">A purged coefficient near one would leave almost no gap, so its size is an empirical question. Rule: the lower 95% bound of the like-for-like gap (VN30–VN100 minus P</w:t>
+        <w:t xml:space="preserve">A purged coefficient near one would leave almost no gap, so the gap size is an empirical question. Rule: the lower 95% bound of the like-for-like gap (VN30–VN100 minus P</w:t>
       </w:r>
       <w:r>
         <w:rPr>
@@ -2746,7 +2761,32 @@
           <w:sz w:val="24"/>
           <w:szCs w:val="24"/>
         </w:rPr>
-        <w:t xml:space="preserve">–VN30) exceeds 0.05, the estimation tolerance of Section 4.4, at every frequency.</w:t>
+        <w:t xml:space="preserve">–VN30; P</w:t>
+      </w:r>
+      <w:r>
+        <w:rPr>
+          <w:rFonts w:ascii="Times New Roman" w:hAnsi="Times New Roman" w:cs="Times New Roman" w:eastAsia="Times New Roman"/>
+          <w:vertAlign w:val="subscript"/>
+          <w:sz w:val="24"/>
+          <w:szCs w:val="24"/>
+        </w:rPr>
+        <w:t xml:space="preserve">cap</w:t>
+      </w:r>
+      <w:r>
+        <w:rPr>
+          <w:rFonts w:ascii="Times New Roman" w:hAnsi="Times New Roman" w:cs="Times New Roman" w:eastAsia="Times New Roman"/>
+          <w:sz w:val="24"/>
+          <w:szCs w:val="24"/>
+        </w:rPr>
+        <w:t xml:space="preserve"> </w:t>
+      </w:r>
+      <w:r>
+        <w:rPr>
+          <w:rFonts w:ascii="Times New Roman" w:hAnsi="Times New Roman" w:cs="Times New Roman" w:eastAsia="Times New Roman"/>
+          <w:sz w:val="24"/>
+          <w:szCs w:val="24"/>
+        </w:rPr>
+        <w:t xml:space="preserve">is the overlap-purged mid-cap series) exceeds 0.05, the estimation tolerance of Section 4.4, at every frequency.</w:t>
       </w:r>
     </w:p>
     <w:p>
@@ -2779,7 +2819,7 @@
           <w:sz w:val="24"/>
           <w:szCs w:val="24"/>
         </w:rPr>
-        <w:t xml:space="preserve">Large caps lead small caps (Lo and MacKinlay 1990; Hou 2007), non-synchronous trading depresses short-horizon correlations (Epps 1979) and information diffuses gradually (Hong and Stein 1999), so broad-market coefficients should rise with the timescale, whereas the identity predicts a damped VN30–VN100 slope. Rule: among eight broad-market slope tests, at least one pair at each of M30 and H1 has a positive slope with a Holm-adjusted studentized p-value below 0.05; we also report robustness to removing the opening bar and an equivalence test for VN30–VN100.</w:t>
+        <w:t xml:space="preserve">Large caps lead small caps (Lo and MacKinlay 1990; Hou 2007), non-synchronous trading depresses short-horizon correlations (Epps 1979) and information diffuses gradually (Hong and Stein 1999). Broad-market coefficients should therefore rise with the timescale, whereas the identity predicts a damped VN30–VN100 slope. Rule: among eight broad-market slope tests, at least one pair at each of M30 and H1 has a positive slope with a Holm-adjusted studentized p-value below 0.05. We also report robustness to removing the opening bar and an equivalence test for VN30–VN100.</w:t>
       </w:r>
     </w:p>
     <w:p>
@@ -2895,7 +2935,7 @@
           <w:sz w:val="24"/>
           <w:szCs w:val="24"/>
         </w:rPr>
-        <w:t xml:space="preserve">Rule: an EWMA or real-time regime correlation has a lower QLIKE loss than the static correlation over 2023–2025, with a Diebold–Mariano p-value below 0.05. These rules, the eight-test family and the factor-loading test were fixed at revision, after the first-round results were known; we also report the original specifications.</w:t>
+        <w:t xml:space="preserve">Rule: an exponentially weighted moving average (EWMA) or real-time regime correlation has a lower quasi-likelihood (QLIKE) loss than the static correlation over 2023–2025, with a Diebold–Mariano p-value below 0.05. We fixed these rules, the eight-test family and the factor-loading test at revision, after the first-round results were known. We also report the original specifications.</w:t>
       </w:r>
     </w:p>
     <w:p>
@@ -2946,7 +2986,7 @@
           <w:sz w:val="24"/>
           <w:szCs w:val="24"/>
         </w:rPr>
-        <w:t xml:space="preserve">Five features of the HOSE matter here. Prices move within a ±7% daily band, which truncates tails and synchronizes limit hits. Settlement moved from T+3 to T+2 on 1 January 2016 (Vietnam Securities Depository 2015), limiting intraday arbitrage. Each day has an opening call auction (09:00–09:15), continuous trading to 11:30, a break to 13:00, continuous trading and a closing call auction (14:30–14:45). Short selling is restricted: Circular 120/2020/TT-BTC (Ministry of Finance of Vietnam 2020) provides a framework for covered short sales that to our knowledge had not been put into operation, naked short selling is prohibited, and the implementing Decree 155/2020/ND-CP (Government of Vietnam 2020) was amended by Decree 245/2025/ND-CP (Government of Vietnam 2025). VN30 futures trade on the Hanoi Stock Exchange but there is no mid-cap future; a VNMIDCAP exchange-traded fund (FUEDCMID) has been listed since 29 September 2022 (Ho Chi Minh City Stock Exchange 2022), so mid caps can be held long but cannot be shorted or hedged with a dedicated derivative. Finally, foreign ownership limits (30% for banks, for example) concentrate foreign flows in large caps with room under their limits, and Vietnam is to be reclassified to Secondary Emerging status from 21 September 2026 (FTSE Russell 2025), after our sample.</w:t>
+        <w:t xml:space="preserve">Six features of the HOSE matter here. Prices move within a ±7% daily band, which truncates tails and synchronizes limit hits. Settlement moved from T+3 to T+2 on 1 January 2016 (Vietnam Securities Depository 2015), limiting intraday arbitrage. Each day has an opening call auction (09:00–09:15), continuous trading to 11:30, a break to 13:00, a second continuous session and a closing call auction (14:30–14:45). Short selling is restricted. Circular 120/2020/TT-BTC (Ministry of Finance of Vietnam 2020) provides a framework for covered short sales that, to our knowledge, had not been put into operation, and naked short selling is prohibited. The implementing Decree 155/2020/ND-CP (Government of Vietnam 2020) was amended by Decree 245/2025/ND-CP (Government of Vietnam 2025). VN30 futures trade on the Hanoi Stock Exchange, but no mid-cap future exists. A VNMIDCAP exchange-traded fund (FUEDCMID) has been listed since 29 September 2022 (Ho Chi Minh City Stock Exchange 2022), so mid caps can be held long but cannot be shorted or hedged with a dedicated derivative. Finally, foreign ownership limits (30% for banks, for example) concentrate foreign flows in large caps with room under their limits. Vietnam is to be reclassified to Secondary Emerging status from 21 September 2026 (FTSE Russell 2025), after the end of our sample.</w:t>
       </w:r>
     </w:p>
     <w:p>
@@ -2979,7 +3019,7 @@
           <w:sz w:val="24"/>
           <w:szCs w:val="24"/>
         </w:rPr>
-        <w:t xml:space="preserve">We use VN30, VN100 and VNINDEX levels exported from TradingView (exchange code HOSE). VN30 holds the 30 largest stocks by free-float capitalization, VN100 adds the next 70 (the VNMIDCAP index) and VNINDEX covers all HOSE stocks at full capitalization. Daily and 30-minute series run to 12 December 2025, 1-hour and 4-hour series to 9 December 2024. M30 bars open at 09:00, 09:30, 10:00, 10:30, 11:00, 11:30, 13:00, 13:30, 14:00, 14:30, H1 bars at 09:00, 10:00, 11:00, 13:00, 14:00, and the two H4 bars cover the two sessions, so the first bar holds the overnight return and the opening auction. The vendor has no full VNMIDCAP history, so the mid-cap segment is recovered from VN30 and VN100 (Section 4.2). Series are merged by exact timestamp joins without filling, and we did not compare them with HOSE closing levels date by date (the replication package records an input checksum). Log returns are</w:t>
+        <w:t xml:space="preserve">We use VN30, VN100 and VNINDEX levels exported from TradingView (exchange code HOSE). VN30 holds the 30 largest stocks by free-float capitalization, VN100 adds the next 70 (the VNMIDCAP index) and VNINDEX covers all HOSE stocks at full capitalization. Daily (1D) and 30-minute (M30) series run to 12 December 2025, 1-hour (H1) and 4-hour (H4) series to 9 December 2024. M30 bars open at 09:00, 09:30, 10:00, 10:30, 11:00, 11:30, 13:00, 13:30, 14:00, 14:30, H1 bars at 09:00, 10:00, 11:00, 13:00, 14:00, and the two H4 bars cover the two sessions, so at every frequency the first bar of the day holds the overnight return and the opening auction. The vendor has no full VNMIDCAP history, so we recover the mid-cap segment from VN30 and VN100 (Section 4.2). We merge the series by exact timestamp joins without filling gaps. We did not compare them with HOSE closing levels date by date; the replication package records an input checksum. Log returns are</w:t>
       </w:r>
     </w:p>
     <w:p>
@@ -3098,7 +3138,7 @@
           <w:sz w:val="24"/>
           <w:szCs w:val="24"/>
         </w:rPr>
-        <w:t xml:space="preserve">The synchronized window (3 January 2017 to 9 December 2024; 1D: N = 1,983; M30: 19,463; H1: 9,879; H4: 3,953) serves cross-frequency comparisons; all other analyses use the full sample (1D: February 2014 to December 2025, N = 2,963; M30: January 2017 to December 2025, 21,942; H1 and H4: January 2014 to December 2024, 13,523 and 5,410). The indices are computed in real time, so reconstitutions and delistings are embedded and there is no survivorship bias.</w:t>
+        <w:t xml:space="preserve">The synchronized window (3 January 2017 to 9 December 2024; 1D: N = 1,983; M30: 19,463; H1: 9,879; H4: 3,953) serves cross-frequency comparisons. All other analyses use the full sample (1D: February 2014 to December 2025, N = 2,963; M30: January 2017 to December 2025, 21,942; H1 and H4: January 2014 to December 2024, 13,523 and 5,410). The indices are computed in real time, so they embed reconstitutions and delistings and carry no survivorship bias.</w:t>
       </w:r>
     </w:p>
     <w:p>
@@ -3113,7 +3153,7 @@
           <w:sz w:val="24"/>
           <w:szCs w:val="24"/>
         </w:rPr>
-        <w:t xml:space="preserve">Regimes use the 20-day rolling standard deviation of returns (Fig. 1). Chronological crises combine a VNINDEX drawdown above 25%, at least 45% of days in the top volatility quartile and a documented trigger: the 2018 margin contraction (drawdown 26.2%, 47% of days in the top quartile), COVID-19 in 2020 (33.5%, 52%) and the 2022 bond-market freeze (40.2%, 60%), 539 days in all, against calm years 2016–2017 and 2023–2024 (1,000 days); the 2021 and 2025 spikes fail the first two conditions (Table S12). Quartile regimes compare the bottom and top quartiles of rolling VNINDEX volatility (10.6% and 20.0% annualized) or of VN30 volatility.</w:t>
+        <w:t xml:space="preserve">Regimes use the 20-day rolling standard deviation of returns (Fig. 1). Chronological crises require a VNINDEX drawdown above 25%, at least 45% of days in the top volatility quartile and a documented trigger: the 2018 margin contraction (drawdown 26.2%, 47% of days in the top quartile), COVID-19 in 2020 (33.5%, 52%) and the 2022 bond-market freeze (40.2%, 60%). The three episodes total 539 days, against calm years 2016–2017 and 2023–2024 (1,000 days); the 2021 and 2025 spikes fail the first two conditions (Table S12). Quartile regimes compare the bottom and top quartiles of rolling VNINDEX volatility (10.6% and 20.0% annualized) or of VN30 volatility.</w:t>
       </w:r>
     </w:p>
     <w:p>
@@ -3248,7 +3288,7 @@
           <w:sz w:val="24"/>
           <w:szCs w:val="24"/>
         </w:rPr>
-        <w:t xml:space="preserve">The DCCA coefficient measures covariance at timescale s after removing local trends (Podobnik and Stanley 2008; Zebende 2011). For return series x and y of length N, the profiles are</w:t>
+        <w:t xml:space="preserve">The DCCA coefficient measures correlation at timescale s after removing local trends (Podobnik and Stanley 2008; Zebende 2011). For return series x and y of length N, the profiles are</w:t>
       </w:r>
     </w:p>
     <w:p>
@@ -3519,7 +3559,7 @@
           <w:sz w:val="24"/>
           <w:szCs w:val="24"/>
         </w:rPr>
-        <w:t xml:space="preserve">Each profile is split into N</w:t>
+        <w:t xml:space="preserve">We split each profile into N</w:t>
       </w:r>
       <w:r>
         <w:rPr>
@@ -3544,7 +3584,7 @@
           <w:sz w:val="24"/>
           <w:szCs w:val="24"/>
         </w:rPr>
-        <w:t xml:space="preserve">= ⌊N/s⌋ boxes of length s from each end of the series (2N</w:t>
+        <w:t xml:space="preserve">= ⌊N/s⌋ boxes of length s, starting from each end of the series (2N</w:t>
       </w:r>
       <w:r>
         <w:rPr>
@@ -3569,7 +3609,7 @@
           <w:sz w:val="24"/>
           <w:szCs w:val="24"/>
         </w:rPr>
-        <w:t xml:space="preserve">boxes). In box ν a polynomial of order m (m = 1 unless stated) is fitted by ordinary least squares (OLS), and the residuals ε</w:t>
+        <w:t xml:space="preserve">boxes). In each box ν we fit a polynomial of order m (m = 1 unless stated otherwise) by ordinary least squares (OLS); the residuals ε</w:t>
       </w:r>
       <w:r>
         <w:rPr>
@@ -4492,7 +4532,7 @@
           <w:sz w:val="24"/>
           <w:szCs w:val="24"/>
         </w:rPr>
-        <w:t xml:space="preserve">with w = 0.6826 from the HOSE factsheet of 31 May 2024 (free-float capitalizations of VND 1,316,288 billion and 1,928,303 billion), so that B</w:t>
+        <w:t xml:space="preserve">with w = 0.6826 from the HOSE factsheet of 31 May 2024 (free-float capitalizations of VND 1,316,288 billion and 1,928,303 billion, respectively), so that B</w:t>
       </w:r>
       <w:r>
         <w:rPr>
@@ -4617,7 +4657,7 @@
           <w:sz w:val="24"/>
           <w:szCs w:val="24"/>
         </w:rPr>
-        <w:t xml:space="preserve">is a shadow benchmark: replicating it needs about 315% long VN100 and 215% short VN30. We call ρ</w:t>
+        <w:t xml:space="preserve">is a shadow benchmark: replicating it requires about 315% long VN100 and 215% short VN30. We call ρ</w:t>
       </w:r>
       <w:r>
         <w:rPr>
@@ -5499,7 +5539,7 @@
           <w:sz w:val="24"/>
           <w:szCs w:val="24"/>
         </w:rPr>
-        <w:t xml:space="preserve">With one box and no detrending, Eq. (7) is the classical part–whole correlation (Pearson 1897; Cureton 1966), so the lemma adapts a known identity. It holds scale by scale for detrended coefficients, for the detrending moving-average coefficient (Kristoufek 2014) and for any measure built from a bilinear covariance of linearly filtered series. Five corollaries follow, at a fixed scale that we suppress.</w:t>
+        <w:t xml:space="preserve">With one box and no detrending, Eq. (7) is the classical part–whole correlation (Pearson 1897; Cureton 1966), so the lemma adapts a known identity. It holds scale by scale for detrended coefficients, for the detrending moving-average cross-correlation (DMCA) coefficient (Kristoufek 2014) and for any measure built from a bilinear covariance of linearly filtered series. Five corollaries follow; we fix the scale and suppress it in the notation.</w:t>
       </w:r>
     </w:p>
     <w:p>
@@ -6015,6 +6055,72 @@
           <w:szCs w:val="24"/>
         </w:rPr>
         <w:t xml:space="preserve">Corollary 2 (sensitivity).</w:t>
+      </w:r>
+      <w:r>
+        <w:rPr>
+          <w:rFonts w:ascii="Times New Roman" w:hAnsi="Times New Roman" w:cs="Times New Roman" w:eastAsia="Times New Roman"/>
+          <w:sz w:val="24"/>
+          <w:szCs w:val="24"/>
+        </w:rPr>
+        <w:t xml:space="preserve"> </w:t>
+      </w:r>
+      <w:r>
+        <w:rPr>
+          <w:rFonts w:ascii="Times New Roman" w:hAnsi="Times New Roman" w:cs="Times New Roman" w:eastAsia="Times New Roman"/>
+          <w:sz w:val="24"/>
+          <w:szCs w:val="24"/>
+        </w:rPr>
+        <w:t xml:space="preserve">The sensitivity of ρ</w:t>
+      </w:r>
+      <w:r>
+        <w:rPr>
+          <w:rFonts w:ascii="Times New Roman" w:hAnsi="Times New Roman" w:cs="Times New Roman" w:eastAsia="Times New Roman"/>
+          <w:vertAlign w:val="subscript"/>
+          <w:sz w:val="24"/>
+          <w:szCs w:val="24"/>
+        </w:rPr>
+        <w:t xml:space="preserve">AB</w:t>
+      </w:r>
+      <w:r>
+        <w:rPr>
+          <w:rFonts w:ascii="Times New Roman" w:hAnsi="Times New Roman" w:cs="Times New Roman" w:eastAsia="Times New Roman"/>
+          <w:sz w:val="24"/>
+          <w:szCs w:val="24"/>
+        </w:rPr>
+        <w:t xml:space="preserve"> </w:t>
+      </w:r>
+      <w:r>
+        <w:rPr>
+          <w:rFonts w:ascii="Times New Roman" w:hAnsi="Times New Roman" w:cs="Times New Roman" w:eastAsia="Times New Roman"/>
+          <w:sz w:val="24"/>
+          <w:szCs w:val="24"/>
+        </w:rPr>
+        <w:t xml:space="preserve">to ρ</w:t>
+      </w:r>
+      <w:r>
+        <w:rPr>
+          <w:rFonts w:ascii="Times New Roman" w:hAnsi="Times New Roman" w:cs="Times New Roman" w:eastAsia="Times New Roman"/>
+          <w:vertAlign w:val="subscript"/>
+          <w:sz w:val="24"/>
+          <w:szCs w:val="24"/>
+        </w:rPr>
+        <w:t xml:space="preserve">AM</w:t>
+      </w:r>
+      <w:r>
+        <w:rPr>
+          <w:rFonts w:ascii="Times New Roman" w:hAnsi="Times New Roman" w:cs="Times New Roman" w:eastAsia="Times New Roman"/>
+          <w:sz w:val="24"/>
+          <w:szCs w:val="24"/>
+        </w:rPr>
+        <w:t xml:space="preserve"> </w:t>
+      </w:r>
+      <w:r>
+        <w:rPr>
+          <w:rFonts w:ascii="Times New Roman" w:hAnsi="Times New Roman" w:cs="Times New Roman" w:eastAsia="Times New Roman"/>
+          <w:sz w:val="24"/>
+          <w:szCs w:val="24"/>
+        </w:rPr>
+        <w:t xml:space="preserve">is</w:t>
       </w:r>
     </w:p>
     <w:p>
@@ -7238,7 +7344,7 @@
           <w:sz w:val="24"/>
           <w:szCs w:val="24"/>
         </w:rPr>
-        <w:t xml:space="preserve">. Eq. (7) reproduces the directly estimated VN30–VN100 coefficient at every scale and frequency to within 4.4 × 10⁻¹⁶. All quantities are computed scale by scale and averaged over the reliable range (Section 4.4). Because M is a linear combination of A and B, the decomposition also follows from index-level moments alone (Box 1).</w:t>
+        <w:t xml:space="preserve">. Eq. (7) reproduces the directly estimated VN30–VN100 coefficient at every scale and frequency to within 4.4 × 10⁻¹⁶. We compute all quantities scale by scale and average them over the reliable range (Section 4.4). Because M is a linear combination of A and B, the decomposition also follows from index-level moments alone (Box 1).</w:t>
       </w:r>
     </w:p>
     <w:p>
@@ -8365,7 +8471,7 @@
           <w:sz w:val="24"/>
           <w:szCs w:val="24"/>
         </w:rPr>
-        <w:t xml:space="preserve">in proportion to the gap, and P</w:t>
+        <w:t xml:space="preserve">in proportion to the weight error w</w:t>
       </w:r>
       <w:r>
         <w:rPr>
@@ -8374,6 +8480,31 @@
           <w:sz w:val="24"/>
           <w:szCs w:val="24"/>
         </w:rPr>
+        <w:t xml:space="preserve">t</w:t>
+      </w:r>
+      <w:r>
+        <w:rPr>
+          <w:rFonts w:ascii="Times New Roman" w:hAnsi="Times New Roman" w:cs="Times New Roman" w:eastAsia="Times New Roman"/>
+          <w:sz w:val="24"/>
+          <w:szCs w:val="24"/>
+        </w:rPr>
+        <w:t xml:space="preserve"> </w:t>
+      </w:r>
+      <w:r>
+        <w:rPr>
+          <w:rFonts w:ascii="Times New Roman" w:hAnsi="Times New Roman" w:cs="Times New Roman" w:eastAsia="Times New Roman"/>
+          <w:sz w:val="24"/>
+          <w:szCs w:val="24"/>
+        </w:rPr>
+        <w:t xml:space="preserve">− w, and P</w:t>
+      </w:r>
+      <w:r>
+        <w:rPr>
+          <w:rFonts w:ascii="Times New Roman" w:hAnsi="Times New Roman" w:cs="Times New Roman" w:eastAsia="Times New Roman"/>
+          <w:vertAlign w:val="subscript"/>
+          <w:sz w:val="24"/>
+          <w:szCs w:val="24"/>
+        </w:rPr>
         <w:t xml:space="preserve">cap</w:t>
       </w:r>
       <w:r>
@@ -8390,7 +8521,7 @@
           <w:sz w:val="24"/>
           <w:szCs w:val="24"/>
         </w:rPr>
-        <w:t xml:space="preserve">and VN30 are disjoint only at the exact weight. With a single factsheet snapshot we cannot rebuild the weight path, so each bootstrap replicate draws w from U(0.60, 0.75), an interval around the factsheet weight with room for drift either way, and recomputes P</w:t>
+        <w:t xml:space="preserve">and VN30 are disjoint only at the exact weight. With a single factsheet snapshot we cannot rebuild the weight path, so each bootstrap replicate draws w from U(0.60, 0.75), an interval around the factsheet weight that allows drift in either direction, and recomputes P</w:t>
       </w:r>
       <w:r>
         <w:rPr>
@@ -8490,7 +8621,7 @@
           <w:sz w:val="24"/>
           <w:szCs w:val="24"/>
         </w:rPr>
-        <w:t xml:space="preserve">to the largest scale before the worst-case mean absolute error on 40 log-spaced scales first exceeds 0.05; the grid and tolerance were fixed in advance; a GARCH(1,1)-t(5) calibration (300 simulations) checks heavy tails.</w:t>
+        <w:t xml:space="preserve">to the largest scale before the worst-case mean absolute error on 40 log-spaced scales first exceeds 0.05. We fixed the grid and tolerance in advance. A GARCH(1,1)-t(5) calibration (generalized autoregressive conditional heteroskedasticity with Student-t errors; 300 simulations) checks heavy tails.</w:t>
       </w:r>
     </w:p>
     <w:p>
@@ -8505,7 +8636,7 @@
           <w:sz w:val="24"/>
           <w:szCs w:val="24"/>
         </w:rPr>
-        <w:t xml:space="preserve">Coefficients at different scales come from the same series, so all inference resamples the data with the stationary block bootstrap (Politis and Romano 1994), with mean blocks of about 20 trading days, recomputing every curve and statistic per replicate. We use 499 replications for the DCCA statistics of Tables 4–6 and for the decomposition, hedge-effectiveness and tail-dependence statistics, 399 for the like-for-like gap under weight uncertainty, 199 for the trimmed-bar checks of Section 5.4 and Tables S7 and S15 and the 30-minute block-length checks of Table S6, 999 for the factor-model, lead–lag and materiality statistics and for the Forbes–Rigobon tests under VN30 quartiles, across weights and with 2021 added, and 1,999 for the remaining Forbes–Rigobon and relative-error statistics. Intervals are percentile 95% intervals, capped at ±1 for correlations. Percentile p-values, p = 2 min{k₋ + 1, k₊ + 1}/(B + 1), where k₋ and k₊ count replicates at or below and at or above zero, cannot fall below 0.004 with B = 499 (reported as p &lt; 0.005), and with 19 tests the smallest attainable Holm-adjusted value is 0.076. One-sided Forbes–Rigobon p-values use the re-centred bootstrap distribution, and p-values for Δβ and the residual-variance ratio are studentized. Because of the resolution limit, slope tests also use studentized p-values, 2Φ(−|β̂|/se</w:t>
+        <w:t xml:space="preserve">Coefficients at different scales come from the same series, so all inference resamples the data with the stationary block bootstrap (Politis and Romano 1994) with mean blocks of about 20 trading days and recomputes every curve and statistic in each replicate. We use 499 replications for the DCCA statistics of Tables 4–6 and for the decomposition, hedge-effectiveness and tail-dependence statistics, and 399 for the like-for-like gap under weight uncertainty. We use 199 for the trimmed-bar checks of Section 5.4 and Tables S7 and S15 and the 30-minute block-length checks of Table S6, and 999 for the factor-model, lead–lag and materiality statistics and for the Forbes–Rigobon tests under VN30 quartiles, across weights and with 2021 added. The remaining Forbes–Rigobon and relative-error statistics use 1,999 replications. Intervals are percentile 95% intervals, capped at ±1 for correlations. Percentile p-values, p = 2 min{k₋ + 1, k₊ + 1}/(B + 1), where k₋ and k₊ count replicates at or below and at or above zero, cannot fall below 0.004 with B = 499 (reported as p &lt; 0.005). With 19 tests, the smallest attainable Holm-adjusted value is 0.076. One-sided Forbes–Rigobon p-values use the re-centered bootstrap distribution, and p-values for Δβ and the residual-variance ratio are studentized. Because of the resolution limit, slope tests also use studentized p-values, 2Φ(−|β̂|/se</w:t>
       </w:r>
       <w:r>
         <w:rPr>
@@ -8522,7 +8653,7 @@
           <w:sz w:val="24"/>
           <w:szCs w:val="24"/>
         </w:rPr>
-        <w:t xml:space="preserve">), adjusted by the Holm (1979) and Benjamini and Hochberg (1995) procedures in two families: the original 19 reliable-range tests and the eight broad-market tests of H2. Equivalence of the VN30–VN100 slope to zero is tested by two one-sided tests (TOST; Schuirmann 1987) with a margin of 0.001 per unit of ln s; over the 4.5 units of the M30 reliable range such a slope moves the coefficient by less than a tenth of the 0.05 tolerance.</w:t>
+        <w:t xml:space="preserve">), adjusted by the Holm (1979) and Benjamini and Hochberg (1995) procedures in two families: the original 19 reliable-range tests and the eight broad-market tests of H2. We test equivalence of the VN30–VN100 slope to zero with two one-sided tests (TOST; Schuirmann 1987) and a margin of 0.001 per unit of ln s. Over the 4.5 units of the M30 reliable range, such a slope moves the coefficient by less than a tenth of the 0.05 tolerance.</w:t>
       </w:r>
     </w:p>
     <w:p>
@@ -8555,7 +8686,7 @@
           <w:sz w:val="24"/>
           <w:szCs w:val="24"/>
         </w:rPr>
-        <w:t xml:space="preserve">Horizon dependence is the slope β of</w:t>
+        <w:t xml:space="preserve">We measure horizon dependence by the slope β of</w:t>
       </w:r>
     </w:p>
     <w:p>
@@ -9849,7 +9980,7 @@
           <w:sz w:val="24"/>
           <w:szCs w:val="24"/>
         </w:rPr>
-        <w:t xml:space="preserve">; if crises raise idiosyncratic variance, ρ* is biased toward no contagion (Corsetti et al. 2005). We therefore also test, regime by regime, for changes in the loading β and the residual variance, the contagion concept of Corsetti et al. (2005) and the structural parameter of Rigobon (2003). Regimes are chronological episodes, VNINDEX volatility quartiles or VN30 volatility quartiles; the last sorts on the conditioning variable rather than on a series containing P</w:t>
+        <w:t xml:space="preserve">; if crises raise idiosyncratic variance, ρ* is biased toward no contagion (Corsetti et al. 2005). We therefore also test, regime by regime, for changes in the residual variance and in the loading β; a change in β is contagion in the sense of Corsetti et al. (2005), and β is the structural parameter of Rigobon (2003). Regimes are chronological episodes, VNINDEX volatility quartiles or VN30 volatility quartiles; the last sorts on the conditioning variable rather than on a series containing P</w:t>
       </w:r>
       <w:r>
         <w:rPr>
@@ -9866,7 +9997,7 @@
           <w:sz w:val="24"/>
           <w:szCs w:val="24"/>
         </w:rPr>
-        <w:t xml:space="preserve">. Statistics are Pearson moments of daily returns, bootstrapped within regimes. Nested pairs are not tested, because the parent contains the conditioning index.</w:t>
+        <w:t xml:space="preserve">. Statistics are Pearson moments of daily returns, bootstrapped within regimes. We do not test nested pairs, because the parent contains the conditioning index.</w:t>
       </w:r>
     </w:p>
     <w:p>
@@ -10191,7 +10322,7 @@
           <w:sz w:val="24"/>
           <w:szCs w:val="24"/>
         </w:rPr>
-        <w:t xml:space="preserve">, and |RE| is compared with the bootstrap relative standard error of the regime variance. Because these regimes are ex post, we also estimate correlations on 2014–2022 and evaluate forecasts on 2023–2025. Forecasts share one-step-ahead RiskMetrics variances (λ = 0.94; J.P. Morgan/Reuters 1996) and differ only in the correlation: static, EWMA with the same λ, or a regime correlation chosen in real time from lagged rolling volatility with thresholds fixed in the estimation window. Losses are QLIKE (Patton 2011) and squared error, compared by the Diebold and Mariano (1995) test with a Newey and West (1987) variance (five lags).</w:t>
+        <w:t xml:space="preserve">, and we compare |RE| with the bootstrap relative standard error of the regime variance. Because these regimes are ex post, we also estimate correlations on 2014–2022 and evaluate forecasts on 2023–2025. Forecasts share one-step-ahead RiskMetrics variances (λ = 0.94; J.P. Morgan/Reuters 1996) and differ only in the correlation: static, EWMA with the same λ, or a regime correlation chosen in real time from lagged rolling volatility with thresholds fixed in the estimation window. Losses are QLIKE (Patton 2011) and squared error, compared by the Diebold and Mariano (1995) test with a Newey and West (1987) variance (five lags).</w:t>
       </w:r>
     </w:p>
     <w:p>
@@ -10224,7 +10355,7 @@
           <w:sz w:val="24"/>
           <w:szCs w:val="24"/>
         </w:rPr>
-        <w:t xml:space="preserve">All computations use R 4.3.3 (stats, sandwich 3.1.0, ggplot2 3.4.4) on an Intel Xeon processor (2.10 GHz, four cores). OLS uses the QR decomposition, so no iterative optimization or convergence criterion is involved. Seeds are fixed in each script (20260924 to 20261014; the reliability simulations use fixed seeds starting at 42), and run_all.R reproduces every table and figure with byte-identical CSV outputs. Code, outputs and a map from each number to its output file form Online Resource 1.</w:t>
+        <w:t xml:space="preserve">All computations use R 4.3.3 (stats, sandwich 3.1.0, ggplot2 3.4.4) on an Intel Xeon processor (2.10 GHz, four cores). OLS uses the QR decomposition, so no iterative optimization or convergence criterion is involved. Each script fixes its seeds (20260924 to 20261014; the reliability simulations use fixed seeds starting at 42), and run_all.R reproduces every table and figure with byte-identical CSV outputs. Code, outputs and a map from each number to its output file form Online Resource 1.</w:t>
       </w:r>
     </w:p>
     <w:p>
@@ -12568,7 +12699,7 @@
           <w:sz w:val="20"/>
           <w:szCs w:val="20"/>
         </w:rPr>
-        <w:t xml:space="preserve">Notes: Kurt. is non-excess kurtosis; P</w:t>
+        <w:t xml:space="preserve">Notes: Kurt.: non-excess kurtosis; P</w:t>
       </w:r>
       <w:r>
         <w:rPr>
@@ -12583,14 +12714,7 @@
           <w:sz w:val="20"/>
           <w:szCs w:val="20"/>
         </w:rPr>
-        <w:t xml:space="preserve"> </w:t>
-      </w:r>
-      <w:r>
-        <w:rPr>
-          <w:sz w:val="20"/>
-          <w:szCs w:val="20"/>
-        </w:rPr>
-        <w:t xml:space="preserve">is the overlap-purged series of Eq. (6); *** p &lt; 0.01. Source: Authors’ calculations based on HOSE index data (TradingView).</w:t>
+        <w:t xml:space="preserve">: overlap-purged series of Eq. (6); *** p &lt; 0.01. Source: Authors’ calculations based on HOSE index data (TradingView).</w:t>
       </w:r>
     </w:p>
     <w:p>
@@ -12630,7 +12754,7 @@
           <w:sz w:val="24"/>
           <w:szCs w:val="24"/>
         </w:rPr>
-        <w:t xml:space="preserve">has the highest daily standard deviation (0.0124) and VNINDEX the lowest (0.0115). All series are negatively skewed and leptokurtic (kurtosis above 33 at M30), and the Jarque–Bera test rejects normality everywhere; neither DCCA nor the block bootstrap requires Gaussian returns.</w:t>
+        <w:t xml:space="preserve">has the highest daily standard deviation (0.0124) and VNINDEX the lowest (0.0115). All series are negatively skewed and leptokurtic (kurtosis above 33 at M30), and the Jarque–Bera test rejects normality for every series. Neither DCCA nor the block bootstrap requires Gaussian returns.</w:t>
       </w:r>
     </w:p>
     <w:p>
@@ -13023,7 +13147,22 @@
           <w:sz w:val="20"/>
           <w:szCs w:val="20"/>
         </w:rPr>
-        <w:t xml:space="preserve">Notes: Largest scale (bars) at which the worst-case mean absolute error stays below 0.05; Gaussian: 1,002 white-noise simulations; heavy-tailed: 300 GARCH(1,1)-t(5) simulations. Source: Authors’ calculations.</w:t>
+        <w:t xml:space="preserve">Notes: s</w:t>
+      </w:r>
+      <w:r>
+        <w:rPr>
+          <w:vertAlign w:val="subscript"/>
+          <w:sz w:val="20"/>
+          <w:szCs w:val="20"/>
+        </w:rPr>
+        <w:t xml:space="preserve">rel</w:t>
+      </w:r>
+      <w:r>
+        <w:rPr>
+          <w:sz w:val="20"/>
+          <w:szCs w:val="20"/>
+        </w:rPr>
+        <w:t xml:space="preserve">: largest scale (bars) at which the worst-case mean absolute error stays below 0.05; Gaussian: 1,002 white-noise simulations; heavy-tailed: 300 GARCH(1,1)-t(5) simulations. Source: Authors’ calculations.</w:t>
       </w:r>
     </w:p>
     <w:p>
@@ -13038,7 +13177,7 @@
           <w:sz w:val="24"/>
           <w:szCs w:val="24"/>
         </w:rPr>
-        <w:t xml:space="preserve">Gaussian thresholds range from 50 days at 1D to 444 bars at M30, and heavy tails cut them by about two-thirds. Averages below use the Gaussian thresholds; over the heavy-tailed ranges the nested averages become 0.975–0.979 and the purged average 0.882–0.890, so no conclusion depends on the choice.</w:t>
+        <w:t xml:space="preserve">Gaussian thresholds range from 50 days at 1D to 444 bars at M30, and heavy tails cut them by about two-thirds. Averages below use the Gaussian thresholds. Over the heavy-tailed ranges, the nested averages become 0.975–0.979 and the purged average 0.882–0.890, so no conclusion depends on the choice.</w:t>
       </w:r>
     </w:p>
     <w:p>
@@ -14462,7 +14601,7 @@
           <w:sz w:val="24"/>
           <w:szCs w:val="24"/>
         </w:rPr>
-        <w:t xml:space="preserve">The nested pairs average 0.975–0.980 at every frequency in both samples, P</w:t>
+        <w:t xml:space="preserve">The nested pairs average 0.975–0.980 at every frequency in both samples, and P</w:t>
       </w:r>
       <w:r>
         <w:rPr>
@@ -14479,7 +14618,7 @@
           <w:sz w:val="24"/>
           <w:szCs w:val="24"/>
         </w:rPr>
-        <w:t xml:space="preserve">–VN30 0.883–0.892. Corollary 3 fixes the sign of the like-for-like gap, but not its size: the gap is 0.099–0.104 with interval lower bounds of at least 0.084, above the 0.05 margin at every frequency, so H1 is supported. The three-pair gap, which also uses the broad-market pairs that cannot be purged by weight, is 0.086–0.096, with Cohen’s q (Cohen 1988) of 0.78–0.89, reported descriptively because both coefficients come from the same sample. Overlap thus inflates co-movement that is already strong.</w:t>
+        <w:t xml:space="preserve">–VN30 averages 0.883–0.892. Corollary 3 fixes the sign of the like-for-like gap, but not its size: the gap is 0.099–0.104 with interval lower bounds of at least 0.084, above the 0.05 margin at every frequency, so H1 is supported. The three-pair gap, which also uses the broad-market pairs that cannot be purged by weight, is 0.086–0.096, with Cohen’s q (Cohen 1988) of 0.78–0.89. We report q descriptively because both coefficients come from the same sample. Overlap thus inflates co-movement that is already strong.</w:t>
       </w:r>
     </w:p>
     <w:p>
@@ -14494,7 +14633,7 @@
           <w:sz w:val="24"/>
           <w:szCs w:val="24"/>
         </w:rPr>
-        <w:t xml:space="preserve">The gap depends on the weight: over w = 0.60–0.75 the like-for-like daily gap is 0.063–0.164 and the three-pair gap 0.052–0.153 (Tables S2 and S3). With w drawn in each replicate, the like-for-like intervals have lower bounds of 0.057–0.061 and every replicate exceeds 0.05, so H1 holds under weight uncertainty, although the size of the gap is known only to within a factor of about two.</w:t>
+        <w:t xml:space="preserve">The gap depends on the weight: over w = 0.60–0.75 the daily like-for-like gap is 0.063–0.164 and the three-pair gap 0.052–0.153 (Tables S2 and S3). With w drawn in each replicate, the like-for-like intervals have lower bounds of 0.057–0.061 and every replicate exceeds 0.05, so H1 holds under weight uncertainty. The size of the gap, however, is known only to within a factor of about two.</w:t>
       </w:r>
     </w:p>
     <w:p>
@@ -15897,7 +16036,7 @@
           <w:sz w:val="24"/>
           <w:szCs w:val="24"/>
         </w:rPr>
-        <w:t xml:space="preserve">The sensitivity is 0.106–0.112: moving the index-level number by 0.01 requires the purged coefficient to move by about 0.09, and with weight uncertainty the interval is 0.07–0.17. With κ of 0.48–0.50, the remaining 32% of VN100 contributes about half as much detrended variation as VN30, the benchmark is 0.893–0.900 and the lower bound of Eq. (9) is 0.864–0.875: no purged coefficient in [−1, 1] could push the VN30–VN100 coefficient below about 0.86.</w:t>
+        <w:t xml:space="preserve">The sensitivity is 0.106–0.112: moving the nested coefficient by 0.01 requires the purged coefficient to move by about 0.09. Under weight uncertainty, the sensitivity interval is 0.07–0.17. With κ of 0.48–0.50, the remaining 32% of VN100 contributes about half as much detrended variation as VN30, which puts the benchmark at 0.893–0.900 and the lower bound of Eq. (9) at 0.864–0.875. No purged coefficient in [−1, 1] could push the VN30–VN100 coefficient below about 0.86.</w:t>
       </w:r>
     </w:p>
     <w:p>
@@ -15912,7 +16051,7 @@
           <w:sz w:val="24"/>
           <w:szCs w:val="24"/>
         </w:rPr>
-        <w:t xml:space="preserve">How much of the observed 0.987–0.988 is due to overlap depends on the question. The benchmark-first share is 0.905–0.911 and the dependence-first share 0.895–0.900, because either factor alone produces a coefficient near 0.9; the Shapley split attributes 0.505–0.508 to overlap (intervals within 0.497–0.521). Weight uncertainty widens the Shapley intervals to 0.45–0.56 and the benchmark-first intervals to 0.83–0.95, against a sampling-only width of about 0.02, so weight error dominates the uncertainty of any attribution.</w:t>
+        <w:t xml:space="preserve">The part of the observed 0.987–0.988 attributable to overlap depends on the attribution convention. The benchmark-first share is 0.905–0.911 and the dependence-first share 0.895–0.900, because either factor alone produces a coefficient near 0.9. The Shapley split attributes 0.505–0.508 to overlap (intervals within 0.497–0.521). Weight uncertainty widens the Shapley intervals to 0.45–0.56 and the benchmark-first intervals to 0.83–0.95, against a sampling-only width of about 0.02, so weight error dominates the uncertainty of any attribution.</w:t>
       </w:r>
     </w:p>
     <w:p>
@@ -15927,7 +16066,7 @@
           <w:sz w:val="24"/>
           <w:szCs w:val="24"/>
         </w:rPr>
-        <w:t xml:space="preserve">The decomposition barely varies with the horizon. Across reliable scales and frequencies κ lies in 0.47–0.52, the benchmark varies by 0.007–0.016 within a frequency, and its slope on ln s is not significant at 5% (p = 0.052–0.456; Holm 0.208–0.828), although at M30 the percentile interval just excludes zero; the slope, about −0.002 per unit of ln s, is negligible. On full-sample Pearson moments the benchmark is 0.898–0.903 and the benchmark-first share 0.911–0.914, within 0.01 of the DCCA values. Here the multiscale layer is a check of scale invariance, and Box 1 suffices in practice; the DCCA version matters where tiers scale differently, which Eq. (7) reveals as variation in κ(s).</w:t>
+        <w:t xml:space="preserve">The decomposition barely varies with the horizon. Across reliable scales and frequencies, κ lies in 0.47–0.52, the benchmark varies by 0.007–0.016 within a frequency, and its slope on ln s is not significant at 5% (p = 0.052–0.456; Holm 0.208–0.828), although at M30 the percentile interval just excludes zero. The slope, about −0.002 per unit of ln s, is negligible. On full-sample Pearson moments, the benchmark is 0.898–0.903 and the benchmark-first share 0.911–0.914, within 0.01 of the DCCA values. In these data, the multiscale layer checks scale invariance, and Box 1 suffices in practice. The DCCA version matters where tiers scale differently, which Eq. (7) reveals as variation in κ(s).</w:t>
       </w:r>
     </w:p>
     <w:p>
@@ -16230,7 +16369,7 @@
           <w:sz w:val="24"/>
           <w:szCs w:val="24"/>
         </w:rPr>
-        <w:t xml:space="preserve">Table 6 reports reliable-range slopes for the four main pairs with bootstrap, studentized and adjusted p-values.</w:t>
+        <w:t xml:space="preserve">Table 6 lists reliable-range slopes for the four main pairs with bootstrap, studentized and adjusted p-values.</w:t>
       </w:r>
     </w:p>
     <w:p>
@@ -18581,7 +18720,7 @@
           <w:sz w:val="24"/>
           <w:szCs w:val="24"/>
         </w:rPr>
-        <w:t xml:space="preserve">Positive slopes appear only for broad-market pairs at intraday frequencies. In the H2 family, four slopes survive Holm adjustment (VN100–VNINDEX at H1; VN30–VNINDEX at H1; VN100–VNINDEX at M30; VN30–VNINDEX at M30), with estimates of 0.0019–0.0024, a rise of about 0.01 across the reliable range; none is significant at 1D or H4, so H2 is supported on the full data. Over the original 19 tests, Holm keeps one studentized slope and Benjamini–Hochberg four, and with percentile p-values none survives (smallest BH-adjusted p = 0.057). The VN30–VN100 slope is equivalent to zero at M30 and H1 (TOST p = 0.007, 0.012) and inconclusive elsewhere; the P</w:t>
+        <w:t xml:space="preserve">Positive slopes appear only for broad-market pairs at intraday frequencies. In the H2 family, four slopes survive Holm adjustment (VN100–VNINDEX at H1; VN30–VNINDEX at H1; VN100–VNINDEX at M30; VN30–VNINDEX at M30), with estimates of 0.0019–0.0024, a rise of about 0.01 across the reliable range. None is significant at 1D or H4, so H2 is supported on the full data. Over the original 19 tests, Holm keeps one studentized slope and Benjamini–Hochberg four, and with percentile p-values none survives (smallest Benjamini–Hochberg-adjusted p = 0.057). The VN30–VN100 slope is equivalent to zero at M30 and H1 (TOST p = 0.007, 0.012), and the test is inconclusive elsewhere. The P</w:t>
       </w:r>
       <w:r>
         <w:rPr>
@@ -18598,7 +18737,7 @@
           <w:sz w:val="24"/>
           <w:szCs w:val="24"/>
         </w:rPr>
-        <w:t xml:space="preserve">–VN30 slope is insignificant everywhere.</w:t>
+        <w:t xml:space="preserve">–VN30 slope is not significant at any frequency.</w:t>
       </w:r>
     </w:p>
     <w:p>
@@ -18653,7 +18792,7 @@
           <w:sz w:val="24"/>
           <w:szCs w:val="24"/>
         </w:rPr>
-        <w:t xml:space="preserve">The auction bars drive the intraday result. The first bar of each day holds the overnight return and the opening auction, where intraday volatility peaks (Andersen and Bollerslev 1997): it is 10% of M30 bars but carries 37% of squared VN30 returns, and the last bar holds the closing auction (Table S7). Without the opening bar, the H1 broad-market slopes fall to 0.0003 and −0.0005, and at M30 only VN30–VNINDEX stays significant (0.0020, p = 0.031); without both auction bars the M30 slopes are −0.00002 and −0.0002. Within the same replicates the broad-market slopes exceed the VN30–VN100 slope at M30 and H1 (differences 0.0018–0.0024, p ≤ 0.003), but the differences vanish without the auction bars, while the overlap gap does not change (0.107 [0.094, 0.127] at M30 without the opening bar) and the slope intervals are stable across block lengths (Table S15). Horizon dependence is thus a property of the bars containing the overnight return and the call auctions, not of continuous trading; it is consistent with the Epps (1979) mechanism if the auctions are where prices of less liquid constituents catch up.</w:t>
+        <w:t xml:space="preserve">The auction bars drive the intraday result. The first bar of each day holds the overnight return and the opening auction, where intraday volatility peaks (Andersen and Bollerslev 1997). It accounts for 10% of M30 bars but carries 37% of squared VN30 returns. The last bar holds the closing auction (Table S7). Without the opening bar, the H1 broad-market slopes fall to 0.0003 and −0.0005, and at M30 only VN30–VNINDEX stays significant (0.0020, p = 0.031). Without both auction bars, the M30 slopes are −0.00002 and −0.0002. Within the same replicates, the broad-market slopes exceed the VN30–VN100 slope at M30 and H1 (differences 0.0018–0.0024, p ≤ 0.003), but the differences vanish without the auction bars. The three-pair gap does not change (0.107 [0.094, 0.127] at M30 without the opening bar), and the slope intervals are stable across block lengths (Table S15). Horizon dependence is thus a property of the bars containing the overnight return and the call auctions, not of continuous trading. It is consistent with the Epps (1979) mechanism if the auctions are where prices of less liquid constituents catch up.</w:t>
       </w:r>
     </w:p>
     <w:p>
@@ -18686,7 +18825,7 @@
           <w:sz w:val="24"/>
           <w:szCs w:val="24"/>
         </w:rPr>
-        <w:t xml:space="preserve">Table 7 reports the Forbes–Rigobon and single-factor tests under three regime definitions.</w:t>
+        <w:t xml:space="preserve">Table 7 presents the Forbes–Rigobon and single-factor tests under three regime definitions.</w:t>
       </w:r>
     </w:p>
     <w:p>
@@ -19372,7 +19511,7 @@
           <w:sz w:val="20"/>
           <w:szCs w:val="20"/>
         </w:rPr>
-        <w:t xml:space="preserve">Notes: Daily returns; ρ* from Eq. (15); p (FR): one-sided bootstrap p-value for H0: ρ* ≤ ρ</w:t>
+        <w:t xml:space="preserve">Notes: Daily returns; ρ* from Eq. (15); p (FR): one-sided Forbes–Rigobon bootstrap p-value for H0: ρ* ≤ ρ</w:t>
       </w:r>
       <w:r>
         <w:rPr>
@@ -19424,7 +19563,7 @@
           <w:sz w:val="24"/>
           <w:szCs w:val="24"/>
         </w:rPr>
-        <w:t xml:space="preserve">The raw correlation rises in every definition, from 0.847 to 0.924 chronologically and from 0.744 to 0.932 under VN30 quartiles, but the adjusted crisis correlation never exceeds its calm level (one-sided p = 0.974–0.998; above 0.93 across weights, Table S10), and under VN30 quartiles it is significantly lower (−0.087, [−0.144, −0.018]).</w:t>
+        <w:t xml:space="preserve">The raw correlation rises under every regime definition, from 0.847 to 0.924 chronologically and from 0.744 to 0.932 under VN30 quartiles. The adjusted crisis correlation, however, never exceeds its calm level (one-sided p = 0.974–0.998, and above 0.93 across weights; Table S10), and under VN30 quartiles it is significantly lower (−0.087, [−0.144, −0.018]).</w:t>
       </w:r>
     </w:p>
     <w:p>
@@ -19464,7 +19603,7 @@
           <w:sz w:val="24"/>
           <w:szCs w:val="24"/>
         </w:rPr>
-        <w:t xml:space="preserve">rises by a factor of 2.70 [1.92, 3.68] under VN30 quartiles (2.57 under VNINDEX quartiles), which violates the assumption behind Eq. (15) and pushes ρ* down (Corsetti et al. 2005). The loading rises from 0.737 to 0.948 under VN30 quartiles (Δβ = 0.210, [0.119, 0.306]) but not between chronological episodes (Δβ = 0.008, [−0.128, 0.140]), and adding 2021 as a crisis (789 days) changes neither result (FR p = 0.987; Δβ = −0.005, [−0.122, 0.124]). Under its rule H3 is not supported: high-VN30-volatility days bring both a stronger response of mid caps to large caps and more mid-cap-specific risk. Because the lower-tail dependence of P</w:t>
+        <w:t xml:space="preserve">rises by a factor of 2.70 [1.92, 3.68] under VN30 quartiles (2.57 under VNINDEX quartiles), which violates the assumption behind Eq. (15) and pushes ρ* down (Corsetti et al. 2005). The loading rises from 0.737 to 0.948 under VN30 quartiles (Δβ = 0.210, [0.119, 0.306]) but not between chronological episodes (Δβ = 0.008, [−0.128, 0.140]), and adding 2021 as a crisis (789 days) changes neither result (Forbes–Rigobon p = 0.987; Δβ = −0.005, [−0.122, 0.124]). Under its decision rule, H3 is not supported: on high-VN30-volatility days, mid caps respond more strongly to large caps and also carry more mid-cap-specific risk. Because the lower-tail dependence of P</w:t>
       </w:r>
       <w:r>
         <w:rPr>
@@ -21008,7 +21147,7 @@
           <w:sz w:val="24"/>
           <w:szCs w:val="24"/>
         </w:rPr>
-        <w:t xml:space="preserve">position by 2.23% in chronological calm periods and 9.38% in the low-volatility quartile, and understates it by 1.84% and 2.07% in turbulent regimes, the sign pattern any pooled correlation produces; for nested pairs the misstatement is at most 2.35% (Table S14). Against sampling error the magnitudes are small: |RE| is 0.13–1.50 standard errors of the regime variance for P</w:t>
+        <w:t xml:space="preserve">position by 2.23% in chronological calm periods and 9.38% in the low-volatility quartile, and understates it by 1.84% and 2.07% in turbulent regimes. Any pooled correlation produces this sign pattern. For nested pairs, the misstatement is at most 2.35% (Table S14). Relative to sampling error, the magnitudes are small: |RE| is 0.13–1.50 standard errors of the regime variance for P</w:t>
       </w:r>
       <w:r>
         <w:rPr>
@@ -21058,7 +21197,7 @@
           <w:sz w:val="24"/>
           <w:szCs w:val="24"/>
         </w:rPr>
-        <w:t xml:space="preserve">None of the further checks changes the conclusions. DMCA (Kristoufek 2014), which satisfies the same identity and so checks the detrending only, gives a purged coefficient of 0.882–0.891 and a three-pair gap of 0.086–0.096 (Table S4). The daily gap interval stays within 0.070–0.119 for blocks of 5–60 days (Table S6), and the daily VN30–VNINDEX average is 0.9665, 0.9663 and 0.9667 for detrending orders 1–3. Proxies that replace the capitalization weight, such as a volatility-scaled weight of 0.9865–0.9885, are unstable (Table S8), and shuffled surrogates attribute most of the multifractal range to fat tails (Fig. S1). Lead–lag, hedge-effectiveness and episode statistics are in Tables S9, S11 and S12.</w:t>
+        <w:t xml:space="preserve">None of the further checks changes the conclusions. DMCA (Kristoufek 2014) satisfies the same identity, so it checks only the detrending; it gives a purged coefficient of 0.882–0.891 and a three-pair gap of 0.086–0.096 (Table S4). The daily three-pair gap interval stays within 0.070–0.119 for blocks of 5–60 days (Table S6), and the daily VN30–VNINDEX average is 0.9665, 0.9663 and 0.9667 for detrending orders 1–3. Proxies that replace the capitalization weight, such as the VN30–VN100 correlation (0.9865–0.9885), are unstable (Table S8), and shuffled surrogates attribute most of the multifractal range to fat tails (Fig. S1). Lead–lag, hedge-effectiveness and episode statistics are in Tables S9, S11 and S12.</w:t>
       </w:r>
     </w:p>
     <w:p>
@@ -21861,7 +22000,7 @@
           <w:sz w:val="24"/>
           <w:szCs w:val="24"/>
         </w:rPr>
-        <w:t xml:space="preserve">The nested results have one source. A child’s variation enters every covariance and both standard deviations of a nested pair, and Lemma 1 pins the coefficient near a benchmark set by weight and relative amplitude. With VN30 at 68% of VN100, the benchmark is near 0.90 and the bound near 0.87, so the observed 0.99 says little about how mid caps move with large caps, and changes in the purged coefficient reach it damped by a factor of about ten.</w:t>
+        <w:t xml:space="preserve">One mechanism drives the nested results. A child’s variation enters every covariance and both standard deviations of a nested pair, and Lemma 1 pins the coefficient near a benchmark set by weight and relative amplitude. With VN30 at 68% of VN100, the benchmark is near 0.90 and the bound near 0.87, so the observed 0.99 says little about how mid caps move with large caps. Changes in the purged coefficient reach it damped by a factor of about ten.</w:t>
       </w:r>
     </w:p>
     <w:p>
@@ -21901,7 +22040,7 @@
           <w:sz w:val="24"/>
           <w:szCs w:val="24"/>
         </w:rPr>
-        <w:t xml:space="preserve">returns (cross-autocorrelation 0.084, [0.028, 0.136]) while the reverse is negligible (0.007), an asymmetry of 0.076 [0.048, 0.102] in line with Lo and MacKinlay (1990) and Hou (2007); intraday the lead is symmetric (Table S9). The auction-bar horizon dependence of broad-market pairs fits the Epps (1979) effect for small, less liquid stocks (Chen et al. 2021; Tran and Tran 2025), which index-level data cannot separate from gradual diffusion (Hong and Stein 1999). The higher loading on high-volatility days has several candidate sources that our data cannot rank: herding (Nguyen et al. 2023) and sector connectedness (Bui et al. 2022), limit hits under the ±7% band, margin calls and foreign flows concentrated in large caps with room under ownership limits. The rise in residual variance shows that crises also bring mid-cap-specific shocks, which the Forbes–Rigobon correction misreads as lower dependence.</w:t>
+        <w:t xml:space="preserve">returns (cross-autocorrelation 0.084, [0.028, 0.136]) while the reverse is negligible (0.007), an asymmetry of 0.076 [0.048, 0.102] in line with Lo and MacKinlay (1990) and Hou (2007); at intraday frequencies the lead is symmetric (Table S9). The auction-bar horizon dependence of broad-market pairs fits the Epps (1979) effect for small, less liquid stocks (Chen et al. 2021; Tran and Tran 2025), which index-level data cannot separate from gradual diffusion (Hong and Stein 1999). The higher loading on high-volatility days has several candidate sources that our data cannot rank: herding (Nguyen et al. 2023) and sector connectedness (Bui et al. 2022), limit hits under the ±7% band, margin calls and foreign flows concentrated in large caps with room under ownership limits. The rise in residual variance shows that crises also bring mid-cap-specific shocks, which the Forbes–Rigobon correction misreads as lower dependence.</w:t>
       </w:r>
     </w:p>
     <w:p>
@@ -21934,7 +22073,7 @@
           <w:sz w:val="24"/>
           <w:szCs w:val="24"/>
         </w:rPr>
-        <w:t xml:space="preserve">Nested index correlations used to judge diversification between tiers should first be decomposed. Box 1 does this from published series and the index weight; its key outputs are the purged coefficient and the sensitivity, whose inverse of about 10 shows how ill-conditioned the index-level number is: an error of 0.001 in the nested coefficient becomes about 0.01 in the purged one. Holdings-based risk models are not affected. For hedging, a minimum-variance VN30 hedge removes a share ρ² of mid-cap variance (Ederington 1979), 0.79 [0.75, 0.82] over the full sample but 0.53 [0.45, 0.61] in the low-volatility quartile and 0.86 in the high-volatility quartile (Table S11). A VNMIDCAP ETF holder hedging with VN30 futures keeps about a fifth of the variance on average and about half in calm markets, the basis risk a mid-cap derivative would remove; whether one would be viable we do not study. Regime-conditioned tier correlations are not supported: their in-sample gain is mostly within sampling error and vanishes out of sample. The error that matters is reading a nested correlation as diversification.</w:t>
+        <w:t xml:space="preserve">Users who judge diversification between tiers from nested index correlations should first decompose them. Box 1 does this from published series and the index weight. Its key outputs are the purged coefficient and the sensitivity, whose inverse of about 10 shows how ill-conditioned the index-level number is: an error of 0.001 in the nested coefficient becomes about 0.01 in the purged one. Holdings-based risk models are not affected. For hedging, a minimum-variance VN30 hedge removes a share ρ² of mid-cap variance (Ederington 1979), 0.79 [0.75, 0.82] over the full sample but 0.53 [0.45, 0.61] in the low-volatility quartile and 0.86 in the high-volatility quartile (Table S11). A holder of the VNMIDCAP exchange-traded fund who hedges with VN30 futures keeps about a fifth of the variance on average and about half in calm markets. A mid-cap derivative would remove this basis risk; we do not study whether such a contract would be viable. The case for regime-conditioned tier correlations is not supported: their in-sample gain is mostly within sampling error and vanishes out of sample. For users of index-level data, the error that matters is reading a nested correlation as evidence of diversification.</w:t>
       </w:r>
     </w:p>
     <w:p>
@@ -21967,7 +22106,7 @@
           <w:sz w:val="24"/>
           <w:szCs w:val="24"/>
         </w:rPr>
-        <w:t xml:space="preserve">Lemma 1 applies to any child contained in its parent with a known weight under one weighting scheme. Fig. 4 shows benchmarks above 0.7 whenever the child holds half of the parent and the remainder is no more volatile, so large mechanical components should be common in families such as SET50 within SET100 or IDX30 within LQ45; we did not compute them because we could not verify their weights. With partial overlap the shared constituents form a third component and Eq. (7) does not apply directly. We did not decompose the broad-market pairs: VNINDEX uses full and VN100 free-float capitalization, so VN100 is not a fixed-weight component of VNINDEX, and the mismatch term of Eq. (12) cannot be bounded without constituent data, so the three-pair gap is descriptive for these pairs.</w:t>
+        <w:t xml:space="preserve">Lemma 1 applies to any child contained in its parent with a known weight under one weighting scheme. Fig. 4 shows benchmarks above 0.7 whenever the child holds half of the parent and the remainder is no more volatile, so large mechanical components should be common in families such as SET50 within SET100 or IDX30 within LQ45; we did not compute them because we could not verify their weights. With partial overlap, the shared constituents form a third component, and Eq. (7) does not apply directly. We did not decompose the broad-market pairs: VNINDEX uses full capitalization and VN100 free-float capitalization, so VN100 is not a fixed-weight component of VNINDEX. The mismatch term of Eq. (12) cannot be bounded without constituent data, and the three-pair gap is therefore descriptive for these pairs.</w:t>
       </w:r>
     </w:p>
     <w:p>
@@ -22065,7 +22204,7 @@
           <w:sz w:val="24"/>
           <w:szCs w:val="24"/>
         </w:rPr>
-        <w:t xml:space="preserve">Correlations between nested equity indices contain a component fixed by construction. Carrying the part–whole identity to scale-wise detrended coefficients yields a benchmark, a lower bound, a sensitivity and an order-free attribution, all computable from index-level inputs. On the HOSE the VN30–VN100 coefficient moves by only about 0.11 per unit change in the purged coefficient, and removing the overlap lowers the correlation with large caps by about 0.10. The purged series shows a large-to-small lead, horizon effects confined to the auction bars, a higher mid-cap loading together with more mid-cap-specific risk on volatile days, and no out-of-sample gain from regime-conditioned correlations. Users of index-level data should decompose nested correlations before reading them as evidence about diversification between tiers.</w:t>
+        <w:t xml:space="preserve">Correlations between nested equity indices contain a component fixed by construction. Extending the part–whole identity to scale-wise detrended coefficients yields a benchmark, a lower bound, a sensitivity and an order-free attribution, all computable from index-level inputs. On the HOSE, the VN30–VN100 coefficient moves by only about 0.11 per unit change in the purged coefficient, and removing the overlap lowers the correlation with large caps by about 0.10. The purged series shows a large-to-small lead, horizon effects confined to the auction bars, a higher mid-cap loading together with more mid-cap-specific risk on volatile days, and no out-of-sample gain from regime-conditioned correlations. Users of index-level data should decompose nested correlations before reading them as evidence about diversification between tiers.</w:t>
       </w:r>
     </w:p>
     <w:p>

</xml_diff>